<commit_message>
1. rulebook update 2. Axe buff
</commit_message>
<xml_diff>
--- a/Rules_EN.docx
+++ b/Rules_EN.docx
@@ -131,13 +131,7 @@
         <w:t>Combat</w:t>
       </w:r>
     </w:p>
-    <w:p>
-      <w:pPr>
-        <w:rPr>
-          <w:rFonts w:hint="eastAsia"/>
-        </w:rPr>
-      </w:pPr>
-    </w:p>
+    <w:p/>
     <w:p>
       <w:pPr>
         <w:rPr>
@@ -302,6 +296,7 @@
     </w:p>
     <w:p>
       <w:r>
+        <w:lastRenderedPageBreak/>
         <w:t>When both the hunter and the apprentice choose the forest, the apprentice can deal 1 point of damage to the monster. In other situations, the apprentice going to the forest provides no benefits.</w:t>
       </w:r>
     </w:p>
@@ -477,6 +472,7 @@
           <w:b/>
           <w:bCs/>
         </w:rPr>
+        <w:lastRenderedPageBreak/>
         <w:t>Station:</w:t>
       </w:r>
       <w:r>
@@ -752,6 +748,7 @@
         <w:rPr>
           <w:noProof/>
         </w:rPr>
+        <w:lastRenderedPageBreak/>
         <w:drawing>
           <wp:inline distT="0" distB="0" distL="0" distR="0" wp14:anchorId="233E699A" wp14:editId="2C65EC93">
             <wp:extent cx="3629532" cy="4267796"/>
@@ -914,6 +911,7 @@
         <w:rPr>
           <w:noProof/>
         </w:rPr>
+        <w:lastRenderedPageBreak/>
         <w:drawing>
           <wp:inline distT="0" distB="0" distL="0" distR="0" wp14:anchorId="242A1F67" wp14:editId="7F037E64">
             <wp:extent cx="1914792" cy="1038370"/>
@@ -951,13 +949,7 @@
         </w:drawing>
       </w:r>
     </w:p>
-    <w:p>
-      <w:pPr>
-        <w:rPr>
-          <w:rFonts w:hint="eastAsia"/>
-        </w:rPr>
-      </w:pPr>
-    </w:p>
+    <w:p/>
     <w:p>
       <w:pPr>
         <w:rPr>
@@ -1100,6 +1092,7 @@
         <w:rPr>
           <w:noProof/>
         </w:rPr>
+        <w:lastRenderedPageBreak/>
         <w:drawing>
           <wp:inline distT="0" distB="0" distL="0" distR="0" wp14:anchorId="697A13EB" wp14:editId="0B5B0FE4">
             <wp:extent cx="4629796" cy="3153215"/>
@@ -1186,6 +1179,7 @@
     </w:p>
     <w:p>
       <w:r>
+        <w:lastRenderedPageBreak/>
         <w:t>Once decided, the battle begins.</w:t>
       </w:r>
     </w:p>
@@ -1205,6 +1199,150 @@
       </w:r>
       <w:r>
         <w:t xml:space="preserve"> The player rolls a number of dice equal to their attack power. Damage is calculated based on the weapon's accuracy.</w:t>
+      </w:r>
+      <w:r>
+        <w:rPr>
+          <w:rFonts w:hint="eastAsia"/>
+        </w:rPr>
+        <w:t xml:space="preserve"> </w:t>
+      </w:r>
+      <w:r>
+        <w:t>With a pet in combat, players can benefit from steady bonus damage on every</w:t>
+      </w:r>
+      <w:r>
+        <w:rPr>
+          <w:rFonts w:hint="eastAsia"/>
+        </w:rPr>
+        <w:t xml:space="preserve"> attack</w:t>
+      </w:r>
+      <w:r>
+        <w:t>.</w:t>
+      </w:r>
+    </w:p>
+    <w:p>
+      <w:pPr>
+        <w:numPr>
+          <w:ilvl w:val="1"/>
+          <w:numId w:val="6"/>
+        </w:numPr>
+      </w:pPr>
+      <w:r>
+        <w:rPr>
+          <w:b/>
+          <w:bCs/>
+        </w:rPr>
+        <w:t>Level 1:</w:t>
+      </w:r>
+      <w:r>
+        <w:t xml:space="preserve"> </w:t>
+      </w:r>
+      <w:r>
+        <w:rPr>
+          <w:rFonts w:hint="eastAsia"/>
+        </w:rPr>
+        <w:t>+1 damage</w:t>
+      </w:r>
+    </w:p>
+    <w:p>
+      <w:pPr>
+        <w:numPr>
+          <w:ilvl w:val="1"/>
+          <w:numId w:val="6"/>
+        </w:numPr>
+      </w:pPr>
+      <w:r>
+        <w:rPr>
+          <w:b/>
+          <w:bCs/>
+        </w:rPr>
+        <w:t xml:space="preserve">Level </w:t>
+      </w:r>
+      <w:r>
+        <w:rPr>
+          <w:rFonts w:hint="eastAsia"/>
+          <w:b/>
+          <w:bCs/>
+        </w:rPr>
+        <w:t>2</w:t>
+      </w:r>
+      <w:r>
+        <w:rPr>
+          <w:b/>
+          <w:bCs/>
+        </w:rPr>
+        <w:t>:</w:t>
+      </w:r>
+      <w:r>
+        <w:t xml:space="preserve"> </w:t>
+      </w:r>
+      <w:r>
+        <w:rPr>
+          <w:rFonts w:hint="eastAsia"/>
+        </w:rPr>
+        <w:t>+</w:t>
+      </w:r>
+      <w:r>
+        <w:rPr>
+          <w:rFonts w:hint="eastAsia"/>
+        </w:rPr>
+        <w:t>2</w:t>
+      </w:r>
+      <w:r>
+        <w:rPr>
+          <w:rFonts w:hint="eastAsia"/>
+        </w:rPr>
+        <w:t xml:space="preserve"> damage</w:t>
+      </w:r>
+    </w:p>
+    <w:p>
+      <w:pPr>
+        <w:numPr>
+          <w:ilvl w:val="1"/>
+          <w:numId w:val="6"/>
+        </w:numPr>
+      </w:pPr>
+      <w:r>
+        <w:rPr>
+          <w:b/>
+          <w:bCs/>
+        </w:rPr>
+        <w:t xml:space="preserve">Level </w:t>
+      </w:r>
+      <w:r>
+        <w:rPr>
+          <w:rFonts w:hint="eastAsia"/>
+          <w:b/>
+          <w:bCs/>
+        </w:rPr>
+        <w:t>3</w:t>
+      </w:r>
+      <w:r>
+        <w:rPr>
+          <w:b/>
+          <w:bCs/>
+        </w:rPr>
+        <w:t>:</w:t>
+      </w:r>
+      <w:r>
+        <w:t xml:space="preserve"> </w:t>
+      </w:r>
+      <w:r>
+        <w:rPr>
+          <w:rFonts w:hint="eastAsia"/>
+        </w:rPr>
+        <w:t>+</w:t>
+      </w:r>
+      <w:r>
+        <w:rPr>
+          <w:rFonts w:hint="eastAsia"/>
+        </w:rPr>
+        <w:t>4</w:t>
+      </w:r>
+      <w:r>
+        <w:rPr>
+          <w:rFonts w:hint="eastAsia"/>
+        </w:rPr>
+        <w:t xml:space="preserve"> damage</w:t>
       </w:r>
     </w:p>
     <w:p>
@@ -1304,11 +1442,18 @@
     </w:p>
     <w:p>
       <w:r>
-        <w:t>Each time a player defeats a monster, they gain points and resources and advance on the Weapon Power track. Advancing on the track unlocks new skills.</w:t>
-      </w:r>
-    </w:p>
-    <w:p>
-      <w:r>
+        <w:t xml:space="preserve">Each time a player defeats a monster, they gain points and resources and </w:t>
+      </w:r>
+      <w:r>
+        <w:lastRenderedPageBreak/>
+        <w:t>advance on the Weapon Power track. Advancing on the track unlocks new skills.</w:t>
+      </w:r>
+    </w:p>
+    <w:p>
+      <w:r>
+        <w:rPr>
+          <w:noProof/>
+        </w:rPr>
         <w:drawing>
           <wp:inline distT="0" distB="0" distL="0" distR="0" wp14:anchorId="54F2D0C5" wp14:editId="023FE9A4">
             <wp:extent cx="1991003" cy="1028844"/>
@@ -1347,64 +1492,11 @@
       </w:r>
     </w:p>
     <w:p>
-      <w:pPr>
+      <w:r>
         <w:rPr>
           <w:rFonts w:hint="eastAsia"/>
         </w:rPr>
-      </w:pPr>
-      <w:r>
-        <w:rPr>
-          <w:rFonts w:hint="eastAsia"/>
-        </w:rPr>
-        <w:t xml:space="preserve">Gaining 2 weapon powers unlocks level 2 power; </w:t>
-      </w:r>
-      <w:r>
-        <w:rPr>
-          <w:rFonts w:hint="eastAsia"/>
-        </w:rPr>
-        <w:t xml:space="preserve">Gaining </w:t>
-      </w:r>
-      <w:r>
-        <w:rPr>
-          <w:rFonts w:hint="eastAsia"/>
-        </w:rPr>
-        <w:t>6</w:t>
-      </w:r>
-      <w:r>
-        <w:rPr>
-          <w:rFonts w:hint="eastAsia"/>
-        </w:rPr>
-        <w:t xml:space="preserve"> weapon power</w:t>
-      </w:r>
-      <w:r>
-        <w:rPr>
-          <w:rFonts w:hint="eastAsia"/>
-        </w:rPr>
-        <w:t>s</w:t>
-      </w:r>
-      <w:r>
-        <w:rPr>
-          <w:rFonts w:hint="eastAsia"/>
-        </w:rPr>
-        <w:t xml:space="preserve"> unlocks level </w:t>
-      </w:r>
-      <w:r>
-        <w:rPr>
-          <w:rFonts w:hint="eastAsia"/>
-        </w:rPr>
-        <w:t>3</w:t>
-      </w:r>
-      <w:r>
-        <w:rPr>
-          <w:rFonts w:hint="eastAsia"/>
-        </w:rPr>
-        <w:t xml:space="preserve"> power</w:t>
-      </w:r>
-      <w:r>
-        <w:rPr>
-          <w:rFonts w:hint="eastAsia"/>
-        </w:rPr>
-        <w:t>.</w:t>
+        <w:t>Gaining 2 weapon powers unlocks level 2 power; Gaining 6 weapon powers unlocks level 3 power.</w:t>
       </w:r>
     </w:p>
     <w:sectPr>
@@ -1422,7 +1514,7 @@
   <w:abstractNum w:abstractNumId="0" w15:restartNumberingAfterBreak="0">
     <w:nsid w:val="02B05704"/>
     <w:multiLevelType w:val="multilevel"/>
-    <w:tmpl w:val="F47E1F30"/>
+    <w:tmpl w:val="50FC3328"/>
     <w:lvl w:ilvl="0">
       <w:start w:val="1"/>
       <w:numFmt w:val="decimal"/>
@@ -1435,17 +1527,17 @@
         <w:ind w:left="720" w:hanging="360"/>
       </w:pPr>
     </w:lvl>
-    <w:lvl w:ilvl="1" w:tentative="1">
-      <w:start w:val="1"/>
-      <w:numFmt w:val="decimal"/>
-      <w:lvlText w:val="%2."/>
-      <w:lvlJc w:val="left"/>
-      <w:pPr>
-        <w:tabs>
-          <w:tab w:val="num" w:pos="1440"/>
-        </w:tabs>
-        <w:ind w:left="1440" w:hanging="360"/>
-      </w:pPr>
+    <w:lvl w:ilvl="1">
+      <w:start w:val="1"/>
+      <w:numFmt w:val="bullet"/>
+      <w:lvlText w:val=""/>
+      <w:lvlJc w:val="left"/>
+      <w:pPr>
+        <w:ind w:left="1560" w:hanging="480"/>
+      </w:pPr>
+      <w:rPr>
+        <w:rFonts w:ascii="Wingdings" w:hAnsi="Wingdings" w:hint="default"/>
+      </w:rPr>
     </w:lvl>
     <w:lvl w:ilvl="2" w:tentative="1">
       <w:start w:val="1"/>
@@ -2867,7 +2959,6 @@
   <w:style w:type="character" w:default="1" w:styleId="a0">
     <w:name w:val="Default Paragraph Font"/>
     <w:uiPriority w:val="1"/>
-    <w:semiHidden/>
     <w:unhideWhenUsed/>
   </w:style>
   <w:style w:type="table" w:default="1" w:styleId="a1">

</xml_diff>